<commit_message>
Meeting record: drop the takeaway panel; Mike makes the contractor call
Co-Authored-By: Claude Fable 5.1 <noreply@anthropic.com>
Claude-Session: https://claude.ai/code/session_01LgFPs3fMSncBgbYQ3PfA3o
</commit_message>
<xml_diff>
--- a/output/nzalc-meeting-record.docx
+++ b/output/nzalc-meeting-record.docx
@@ -197,43 +197,6 @@
     </w:p>
     <w:p>
       <w:pPr>
-        <w:pStyle w:val="Normal"/>
-        <w:pBdr>
-          <w:left w:val="single" w:sz="28" w:space="10" w:color="C62026"/>
-        </w:pBdr>
-        <w:shd w:val="clear" w:color="auto" w:fill="002516"/>
-        <w:spacing w:before="80" w:after="120"/>
-        <w:ind w:left="170" w:right="170"/>
-        <w:rPr/>
-      </w:pPr>
-      <w:r>
-        <w:rPr>
-          <w:rFonts w:cs="Arial"/>
-          <w:b/>
-          <w:i w:val="false"/>
-          <w:color w:val="CDD2B7"/>
-          <w:spacing w:val="30"/>
-          <w:sz w:val="15"/>
-        </w:rPr>
-        <w:t>KEY TAKEAWAY</w:t>
-      </w:r>
-      <w:r>
-        <w:rPr/>
-        <w:br/>
-      </w:r>
-      <w:r>
-        <w:rPr>
-          <w:rFonts w:cs="Arial"/>
-          <w:b/>
-          <w:i w:val="false"/>
-          <w:color w:val="FFFFFF"/>
-          <w:sz w:val="20"/>
-        </w:rPr>
-        <w:t>The centre's problem is no longer primarily designing good training. The material and delivery architecture are increasingly mature. The next phase is about institutionalising it: instructor behaviours, induction, SOPs, assurance, administrative discipline, and ensuring programmes such as Nemesis genuinely deliver the outcomes they claim to deliver.</w:t>
-      </w:r>
-    </w:p>
-    <w:p>
-      <w:pPr>
         <w:pStyle w:val="Heading1"/>
         <w:rPr/>
       </w:pPr>
@@ -458,7 +421,7 @@
           <w:b w:val="false"/>
           <w:i w:val="false"/>
         </w:rPr>
-        <w:t>Actions for Mike unless otherwise stated. High-priority actions are shaded.</w:t>
+        <w:t>Actions for Mike. High-priority actions are shaded.</w:t>
       </w:r>
     </w:p>
     <w:tbl>
@@ -1003,7 +966,7 @@
                 <w:i w:val="false"/>
                 <w:sz w:val="19"/>
               </w:rPr>
-              <w:t>Close out the contractor engagement and ensure no expectation of future work remains. Jim makes the formal close-out call; Mike is accountable for confirming closure</w:t>
+              <w:t>Make the close-out call to Drew, formally ending the contractor engagement and ensuring no expectation of future work remains</w:t>
             </w:r>
           </w:p>
         </w:tc>
@@ -1030,7 +993,7 @@
                 <w:i w:val="false"/>
                 <w:sz w:val="19"/>
               </w:rPr>
-              <w:t>Jim (call); Mike (closure)</w:t>
+              <w:t>Mike</w:t>
             </w:r>
           </w:p>
         </w:tc>
@@ -1868,50 +1831,6 @@
         </w:tc>
       </w:tr>
     </w:tbl>
-    <w:p>
-      <w:pPr>
-        <w:pStyle w:val="Normal"/>
-        <w:spacing w:before="0" w:after="80"/>
-        <w:rPr/>
-      </w:pPr>
-      <w:r>
-        <w:rPr/>
-      </w:r>
-    </w:p>
-    <w:p>
-      <w:pPr>
-        <w:pStyle w:val="Heading1"/>
-        <w:rPr/>
-      </w:pPr>
-      <w:r>
-        <w:rPr>
-          <w:rFonts w:cs="Arial"/>
-          <w:b/>
-          <w:i w:val="false"/>
-          <w:color w:val="002516"/>
-          <w:sz w:val="25"/>
-        </w:rPr>
-        <w:t>Ownership Note</w:t>
-      </w:r>
-    </w:p>
-    <w:p>
-      <w:pPr>
-        <w:pStyle w:val="Normal"/>
-        <w:widowControl/>
-        <w:bidi w:val="0"/>
-        <w:spacing w:lineRule="auto" w:line="268" w:before="0" w:after="100"/>
-        <w:jc w:val="left"/>
-        <w:rPr/>
-      </w:pPr>
-      <w:r>
-        <w:rPr>
-          <w:rFonts w:cs="Arial"/>
-          <w:b w:val="false"/>
-          <w:i w:val="false"/>
-        </w:rPr>
-        <w:t>The formal close-out call to the contractor belongs to Jim, who was tasked with it at the meeting. Mike remains accountable for ensuring the engagement is closed and that no expectation of future work remains, and for the wider fix: a repeatable onboarding SOP rather than a one-off personnel response.</w:t>
-      </w:r>
-    </w:p>
     <w:sectPr>
       <w:headerReference w:type="even" r:id="rId3"/>
       <w:headerReference w:type="default" r:id="rId4"/>

</xml_diff>

<commit_message>
Meeting record: apply HQ Co-ord markup and reassign action owners
Co-Authored-By: Claude Fable 5.1 <noreply@anthropic.com>
Claude-Session: https://claude.ai/code/session_01LgFPs3fMSncBgbYQ3PfA3o
</commit_message>
<xml_diff>
--- a/output/nzalc-meeting-record.docx
+++ b/output/nzalc-meeting-record.docx
@@ -54,26 +54,6 @@
         <w:pStyle w:val="Normal"/>
         <w:keepNext w:val="true"/>
         <w:pageBreakBefore w:val="false"/>
-        <w:spacing w:before="0" w:after="0"/>
-        <w:rPr/>
-      </w:pPr>
-      <w:r>
-        <w:rPr>
-          <w:rFonts w:cs="Arial"/>
-          <w:b/>
-          <w:i w:val="false"/>
-          <w:color w:val="002516"/>
-          <w:spacing w:val="40"/>
-          <w:sz w:val="20"/>
-        </w:rPr>
-        <w:t>MEETING RECORD</w:t>
-      </w:r>
-    </w:p>
-    <w:p>
-      <w:pPr>
-        <w:pStyle w:val="Normal"/>
-        <w:keepNext w:val="true"/>
-        <w:pageBreakBefore w:val="false"/>
         <w:spacing w:before="0" w:after="80"/>
         <w:rPr/>
       </w:pPr>
@@ -106,7 +86,7 @@
           <w:spacing w:val="30"/>
           <w:sz w:val="19"/>
         </w:rPr>
-        <w:t>NZALC COMMAND AND STAFF MEETING</w:t>
+        <w:t>HQ CO-ORD</w:t>
       </w:r>
     </w:p>
     <w:p>
@@ -208,7 +188,7 @@
           <w:color w:val="002516"/>
           <w:sz w:val="25"/>
         </w:rPr>
-        <w:t>Five Priorities</w:t>
+        <w:t>Priorities</w:t>
       </w:r>
     </w:p>
     <w:p>
@@ -344,42 +324,6 @@
           <w:b/>
           <w:i w:val="false"/>
         </w:rPr>
-        <w:t>Administration and assurance need continued focus.</w:t>
-      </w:r>
-      <w:r>
-        <w:rPr>
-          <w:rFonts w:cs="Arial"/>
-          <w:b w:val="false"/>
-          <w:i w:val="false"/>
-        </w:rPr>
-        <w:t xml:space="preserve"> H&amp;S audit actions, visitor management, signage, security training, POs and invoices and contractor administration are progressing but require active tracking. Jim's field strengths are recognised; the answer is to provide more deliberate administrative support and prioritisation around him rather than allowing critical tasks to drift.</w:t>
-      </w:r>
-    </w:p>
-    <w:p>
-      <w:pPr>
-        <w:pStyle w:val="Normal"/>
-        <w:tabs>
-          <w:tab w:val="clear" w:pos="720"/>
-          <w:tab w:val="left" w:pos="397" w:leader="none"/>
-        </w:tabs>
-        <w:spacing w:before="60" w:after="40"/>
-        <w:ind w:hanging="397" w:left="397"/>
-        <w:rPr/>
-      </w:pPr>
-      <w:r>
-        <w:rPr>
-          <w:rFonts w:cs="Arial"/>
-          <w:color w:val="000000"/>
-        </w:rPr>
-        <w:t>5.</w:t>
-        <w:tab/>
-      </w:r>
-      <w:r>
-        <w:rPr>
-          <w:rFonts w:cs="Arial"/>
-          <w:b/>
-          <w:i w:val="false"/>
-        </w:rPr>
         <w:t>The unit is otherwise in a good operational position.</w:t>
       </w:r>
       <w:r>
@@ -421,7 +365,7 @@
           <w:b w:val="false"/>
           <w:i w:val="false"/>
         </w:rPr>
-        <w:t>Actions for Mike. High-priority actions are shaded.</w:t>
+        <w:t>Actions agreed at the HQ Co-ord. High-priority actions are shaded.</w:t>
       </w:r>
     </w:p>
     <w:tbl>
@@ -648,7 +592,7 @@
                 <w:i w:val="false"/>
                 <w:sz w:val="19"/>
               </w:rPr>
-              <w:t>Mike</w:t>
+              <w:t>Tony</w:t>
             </w:r>
           </w:p>
         </w:tc>
@@ -763,7 +707,7 @@
                 <w:i w:val="false"/>
                 <w:sz w:val="19"/>
               </w:rPr>
-              <w:t>Mike</w:t>
+              <w:t>Red</w:t>
             </w:r>
           </w:p>
         </w:tc>
@@ -878,7 +822,7 @@
                 <w:i w:val="false"/>
                 <w:sz w:val="19"/>
               </w:rPr>
-              <w:t>Mike</w:t>
+              <w:t>Tony</w:t>
             </w:r>
           </w:p>
         </w:tc>
@@ -1223,7 +1167,7 @@
                 <w:i w:val="false"/>
                 <w:sz w:val="19"/>
               </w:rPr>
-              <w:t>Mike</w:t>
+              <w:t>Jim</w:t>
             </w:r>
           </w:p>
         </w:tc>
@@ -1311,7 +1255,7 @@
                 <w:i w:val="false"/>
                 <w:sz w:val="19"/>
               </w:rPr>
-              <w:t>Coordinate with Jim and Dave Bertram on leadership journal use and briefing for current and upcoming courses</w:t>
+              <w:t>Prepare the ATG submission presentation and have Dave review it</w:t>
             </w:r>
           </w:p>
         </w:tc>
@@ -1365,7 +1309,7 @@
                 <w:i w:val="false"/>
                 <w:sz w:val="19"/>
               </w:rPr>
-              <w:t>Current courses</w:t>
+              <w:t>Wed to Thu</w:t>
             </w:r>
           </w:p>
         </w:tc>
@@ -1426,7 +1370,7 @@
                 <w:i w:val="false"/>
                 <w:sz w:val="19"/>
               </w:rPr>
-              <w:t>Prepare the ATG submission presentation and have Dave review it</w:t>
+              <w:t>Develop the leadership-development programme for the 16 to 17 Nov Linton team-building activity, including allocation of instructors and session responsibilities</w:t>
             </w:r>
           </w:p>
         </w:tc>
@@ -1453,7 +1397,7 @@
                 <w:i w:val="false"/>
                 <w:sz w:val="19"/>
               </w:rPr>
-              <w:t>Mike</w:t>
+              <w:t>TBC</w:t>
             </w:r>
           </w:p>
         </w:tc>
@@ -1480,7 +1424,7 @@
                 <w:i w:val="false"/>
                 <w:sz w:val="19"/>
               </w:rPr>
-              <w:t>Wed to Thu</w:t>
+              <w:t>Before Nov</w:t>
             </w:r>
           </w:p>
         </w:tc>
@@ -1495,7 +1439,7 @@
             <w:tcBorders>
               <w:top w:val="single" w:sz="4" w:space="0" w:color="D9D9D2"/>
               <w:left w:val="single" w:sz="4" w:space="0" w:color="A89662"/>
-              <w:bottom w:val="single" w:sz="4" w:space="0" w:color="D9D9D2"/>
+              <w:bottom w:val="single" w:sz="4" w:space="0" w:color="A89662"/>
               <w:right w:val="single" w:sz="4" w:space="0" w:color="D9D9D2"/>
             </w:tcBorders>
             <w:shd w:color="auto" w:fill="EEF1E5" w:val="clear"/>
@@ -1524,24 +1468,24 @@
             <w:tcBorders>
               <w:top w:val="single" w:sz="4" w:space="0" w:color="D9D9D2"/>
               <w:left w:val="single" w:sz="4" w:space="0" w:color="D9D9D2"/>
-              <w:bottom w:val="single" w:sz="4" w:space="0" w:color="D9D9D2"/>
-              <w:right w:val="single" w:sz="4" w:space="0" w:color="D9D9D2"/>
-            </w:tcBorders>
-          </w:tcPr>
-          <w:p>
-            <w:pPr>
-              <w:pStyle w:val="Normal"/>
-              <w:spacing w:lineRule="auto" w:line="264" w:before="0" w:after="0"/>
-              <w:rPr/>
-            </w:pPr>
-            <w:r>
-              <w:rPr>
-                <w:rFonts w:cs="Arial"/>
-                <w:b w:val="false"/>
-                <w:i w:val="false"/>
-                <w:sz w:val="19"/>
-              </w:rPr>
-              <w:t>Develop the leadership-development programme for the 16 to 17 Nov Linton team-building activity, including allocation of instructors and session responsibilities</w:t>
+              <w:bottom w:val="single" w:sz="4" w:space="0" w:color="A89662"/>
+              <w:right w:val="single" w:sz="4" w:space="0" w:color="D9D9D2"/>
+            </w:tcBorders>
+          </w:tcPr>
+          <w:p>
+            <w:pPr>
+              <w:pStyle w:val="Normal"/>
+              <w:spacing w:lineRule="auto" w:line="264" w:before="0" w:after="0"/>
+              <w:rPr/>
+            </w:pPr>
+            <w:r>
+              <w:rPr>
+                <w:rFonts w:cs="Arial"/>
+                <w:b w:val="false"/>
+                <w:i w:val="false"/>
+                <w:sz w:val="19"/>
+              </w:rPr>
+              <w:t>Organise the end-of-year farewell event, investigating the week of 23 Nov as the preferred option</w:t>
             </w:r>
           </w:p>
         </w:tc>
@@ -1551,254 +1495,24 @@
             <w:tcBorders>
               <w:top w:val="single" w:sz="4" w:space="0" w:color="D9D9D2"/>
               <w:left w:val="single" w:sz="4" w:space="0" w:color="D9D9D2"/>
-              <w:bottom w:val="single" w:sz="4" w:space="0" w:color="D9D9D2"/>
-              <w:right w:val="single" w:sz="4" w:space="0" w:color="D9D9D2"/>
-            </w:tcBorders>
-          </w:tcPr>
-          <w:p>
-            <w:pPr>
-              <w:pStyle w:val="Normal"/>
-              <w:spacing w:lineRule="auto" w:line="264" w:before="0" w:after="0"/>
-              <w:rPr/>
-            </w:pPr>
-            <w:r>
-              <w:rPr>
-                <w:rFonts w:cs="Arial"/>
-                <w:b w:val="false"/>
-                <w:i w:val="false"/>
-                <w:sz w:val="19"/>
-              </w:rPr>
-              <w:t>Mike</w:t>
-            </w:r>
-          </w:p>
-        </w:tc>
-        <w:tc>
-          <w:tcPr>
-            <w:tcW w:w="1416" w:type="dxa"/>
-            <w:tcBorders>
-              <w:top w:val="single" w:sz="4" w:space="0" w:color="D9D9D2"/>
-              <w:left w:val="single" w:sz="4" w:space="0" w:color="D9D9D2"/>
-              <w:bottom w:val="single" w:sz="4" w:space="0" w:color="D9D9D2"/>
-              <w:right w:val="single" w:sz="4" w:space="0" w:color="A89662"/>
-            </w:tcBorders>
-          </w:tcPr>
-          <w:p>
-            <w:pPr>
-              <w:pStyle w:val="Normal"/>
-              <w:spacing w:lineRule="auto" w:line="264" w:before="0" w:after="0"/>
-              <w:rPr/>
-            </w:pPr>
-            <w:r>
-              <w:rPr>
-                <w:rFonts w:cs="Arial"/>
-                <w:b w:val="false"/>
-                <w:i w:val="false"/>
-                <w:sz w:val="19"/>
-              </w:rPr>
-              <w:t>Before Nov</w:t>
-            </w:r>
-          </w:p>
-        </w:tc>
-      </w:tr>
-      <w:tr>
-        <w:trPr>
-          <w:cantSplit w:val="true"/>
-        </w:trPr>
-        <w:tc>
-          <w:tcPr>
-            <w:tcW w:w="1019" w:type="dxa"/>
-            <w:tcBorders>
-              <w:top w:val="single" w:sz="4" w:space="0" w:color="D9D9D2"/>
-              <w:left w:val="single" w:sz="4" w:space="0" w:color="A89662"/>
-              <w:bottom w:val="single" w:sz="4" w:space="0" w:color="D9D9D2"/>
-              <w:right w:val="single" w:sz="4" w:space="0" w:color="D9D9D2"/>
-            </w:tcBorders>
-            <w:shd w:color="auto" w:fill="EEF1E5" w:val="clear"/>
-          </w:tcPr>
-          <w:p>
-            <w:pPr>
-              <w:pStyle w:val="Normal"/>
-              <w:spacing w:lineRule="auto" w:line="264" w:before="0" w:after="0"/>
-              <w:rPr/>
-            </w:pPr>
-            <w:r>
-              <w:rPr>
-                <w:rFonts w:cs="Arial"/>
-                <w:b/>
-                <w:i w:val="false"/>
-                <w:color w:val="002516"/>
-                <w:sz w:val="18"/>
-              </w:rPr>
-              <w:t>Medium</w:t>
-            </w:r>
-          </w:p>
-        </w:tc>
-        <w:tc>
-          <w:tcPr>
-            <w:tcW w:w="5217" w:type="dxa"/>
-            <w:tcBorders>
-              <w:top w:val="single" w:sz="4" w:space="0" w:color="D9D9D2"/>
-              <w:left w:val="single" w:sz="4" w:space="0" w:color="D9D9D2"/>
-              <w:bottom w:val="single" w:sz="4" w:space="0" w:color="D9D9D2"/>
-              <w:right w:val="single" w:sz="4" w:space="0" w:color="D9D9D2"/>
-            </w:tcBorders>
-          </w:tcPr>
-          <w:p>
-            <w:pPr>
-              <w:pStyle w:val="Normal"/>
-              <w:spacing w:lineRule="auto" w:line="264" w:before="0" w:after="0"/>
-              <w:rPr/>
-            </w:pPr>
-            <w:r>
-              <w:rPr>
-                <w:rFonts w:cs="Arial"/>
-                <w:b w:val="false"/>
-                <w:i w:val="false"/>
-                <w:sz w:val="19"/>
-              </w:rPr>
-              <w:t>Organise the end-of-year farewell event, investigating the week of 23 Nov as the preferred option</w:t>
-            </w:r>
-          </w:p>
-        </w:tc>
-        <w:tc>
-          <w:tcPr>
-            <w:tcW w:w="1644" w:type="dxa"/>
-            <w:tcBorders>
-              <w:top w:val="single" w:sz="4" w:space="0" w:color="D9D9D2"/>
-              <w:left w:val="single" w:sz="4" w:space="0" w:color="D9D9D2"/>
-              <w:bottom w:val="single" w:sz="4" w:space="0" w:color="D9D9D2"/>
-              <w:right w:val="single" w:sz="4" w:space="0" w:color="D9D9D2"/>
-            </w:tcBorders>
-          </w:tcPr>
-          <w:p>
-            <w:pPr>
-              <w:pStyle w:val="Normal"/>
-              <w:spacing w:lineRule="auto" w:line="264" w:before="0" w:after="0"/>
-              <w:rPr/>
-            </w:pPr>
-            <w:r>
-              <w:rPr>
-                <w:rFonts w:cs="Arial"/>
-                <w:b w:val="false"/>
-                <w:i w:val="false"/>
-                <w:sz w:val="19"/>
-              </w:rPr>
-              <w:t>Mike</w:t>
-            </w:r>
-          </w:p>
-        </w:tc>
-        <w:tc>
-          <w:tcPr>
-            <w:tcW w:w="1416" w:type="dxa"/>
-            <w:tcBorders>
-              <w:top w:val="single" w:sz="4" w:space="0" w:color="D9D9D2"/>
-              <w:left w:val="single" w:sz="4" w:space="0" w:color="D9D9D2"/>
-              <w:bottom w:val="single" w:sz="4" w:space="0" w:color="D9D9D2"/>
-              <w:right w:val="single" w:sz="4" w:space="0" w:color="A89662"/>
-            </w:tcBorders>
-          </w:tcPr>
-          <w:p>
-            <w:pPr>
-              <w:pStyle w:val="Normal"/>
-              <w:spacing w:lineRule="auto" w:line="264" w:before="0" w:after="0"/>
-              <w:rPr/>
-            </w:pPr>
-            <w:r>
-              <w:rPr>
-                <w:rFonts w:cs="Arial"/>
-                <w:b w:val="false"/>
-                <w:i w:val="false"/>
-                <w:sz w:val="19"/>
-              </w:rPr>
-              <w:t>Confirm soon</w:t>
-            </w:r>
-          </w:p>
-        </w:tc>
-      </w:tr>
-      <w:tr>
-        <w:trPr>
-          <w:cantSplit w:val="true"/>
-        </w:trPr>
-        <w:tc>
-          <w:tcPr>
-            <w:tcW w:w="1019" w:type="dxa"/>
-            <w:tcBorders>
-              <w:top w:val="single" w:sz="4" w:space="0" w:color="D9D9D2"/>
-              <w:left w:val="single" w:sz="4" w:space="0" w:color="A89662"/>
               <w:bottom w:val="single" w:sz="4" w:space="0" w:color="A89662"/>
               <w:right w:val="single" w:sz="4" w:space="0" w:color="D9D9D2"/>
             </w:tcBorders>
-            <w:shd w:color="auto" w:fill="EEF1E5" w:val="clear"/>
-          </w:tcPr>
-          <w:p>
-            <w:pPr>
-              <w:pStyle w:val="Normal"/>
-              <w:spacing w:lineRule="auto" w:line="264" w:before="0" w:after="0"/>
-              <w:rPr/>
-            </w:pPr>
-            <w:r>
-              <w:rPr>
-                <w:rFonts w:cs="Arial"/>
-                <w:b/>
-                <w:i w:val="false"/>
-                <w:color w:val="002516"/>
-                <w:sz w:val="18"/>
-              </w:rPr>
-              <w:t>Medium</w:t>
-            </w:r>
-          </w:p>
-        </w:tc>
-        <w:tc>
-          <w:tcPr>
-            <w:tcW w:w="5217" w:type="dxa"/>
-            <w:tcBorders>
-              <w:top w:val="single" w:sz="4" w:space="0" w:color="D9D9D2"/>
-              <w:left w:val="single" w:sz="4" w:space="0" w:color="D9D9D2"/>
-              <w:bottom w:val="single" w:sz="4" w:space="0" w:color="A89662"/>
-              <w:right w:val="single" w:sz="4" w:space="0" w:color="D9D9D2"/>
-            </w:tcBorders>
-          </w:tcPr>
-          <w:p>
-            <w:pPr>
-              <w:pStyle w:val="Normal"/>
-              <w:spacing w:lineRule="auto" w:line="264" w:before="0" w:after="0"/>
-              <w:rPr/>
-            </w:pPr>
-            <w:r>
-              <w:rPr>
-                <w:rFonts w:cs="Arial"/>
-                <w:b w:val="false"/>
-                <w:i w:val="false"/>
-                <w:sz w:val="19"/>
-              </w:rPr>
-              <w:t>Provide Jim targeted admin support, particularly safety assurance, contractor administration and PO tracking</w:t>
-            </w:r>
-          </w:p>
-        </w:tc>
-        <w:tc>
-          <w:tcPr>
-            <w:tcW w:w="1644" w:type="dxa"/>
-            <w:tcBorders>
-              <w:top w:val="single" w:sz="4" w:space="0" w:color="D9D9D2"/>
-              <w:left w:val="single" w:sz="4" w:space="0" w:color="D9D9D2"/>
-              <w:bottom w:val="single" w:sz="4" w:space="0" w:color="A89662"/>
-              <w:right w:val="single" w:sz="4" w:space="0" w:color="D9D9D2"/>
-            </w:tcBorders>
-          </w:tcPr>
-          <w:p>
-            <w:pPr>
-              <w:pStyle w:val="Normal"/>
-              <w:spacing w:lineRule="auto" w:line="264" w:before="0" w:after="0"/>
-              <w:rPr/>
-            </w:pPr>
-            <w:r>
-              <w:rPr>
-                <w:rFonts w:cs="Arial"/>
-                <w:b w:val="false"/>
-                <w:i w:val="false"/>
-                <w:sz w:val="19"/>
-              </w:rPr>
-              <w:t>Mike</w:t>
+          </w:tcPr>
+          <w:p>
+            <w:pPr>
+              <w:pStyle w:val="Normal"/>
+              <w:spacing w:lineRule="auto" w:line="264" w:before="0" w:after="0"/>
+              <w:rPr/>
+            </w:pPr>
+            <w:r>
+              <w:rPr>
+                <w:rFonts w:cs="Arial"/>
+                <w:b w:val="false"/>
+                <w:i w:val="false"/>
+                <w:sz w:val="19"/>
+              </w:rPr>
+              <w:t>Red</w:t>
             </w:r>
           </w:p>
         </w:tc>
@@ -1825,7 +1539,7 @@
                 <w:i w:val="false"/>
                 <w:sz w:val="19"/>
               </w:rPr>
-              <w:t>Ongoing</w:t>
+              <w:t>Confirm soon</w:t>
             </w:r>
           </w:p>
         </w:tc>

</xml_diff>

<commit_message>
Meeting record subtitle: NZALC HQ Co-ord
Co-Authored-By: Claude Fable 5.1 <noreply@anthropic.com>
Claude-Session: https://claude.ai/code/session_01LgFPs3fMSncBgbYQ3PfA3o
</commit_message>
<xml_diff>
--- a/output/nzalc-meeting-record.docx
+++ b/output/nzalc-meeting-record.docx
@@ -86,7 +86,7 @@
           <w:spacing w:val="30"/>
           <w:sz w:val="19"/>
         </w:rPr>
-        <w:t>HQ CO-ORD</w:t>
+        <w:t>NZALC HQ CO-ORD</w:t>
       </w:r>
     </w:p>
     <w:p>
@@ -365,7 +365,7 @@
           <w:b w:val="false"/>
           <w:i w:val="false"/>
         </w:rPr>
-        <w:t>Actions agreed at the HQ Co-ord. High-priority actions are shaded.</w:t>
+        <w:t>Actions agreed at the NZALC HQ Co-ord. High-priority actions are shaded.</w:t>
       </w:r>
     </w:p>
     <w:tbl>

</xml_diff>